<commit_message>
Rework the ResumeForge optimizer experience.
Align the frontend with the newer ATS optimizer flow and update the tailoring engine, scoring routes, and supporting docs to match the current local app behavior.

Made-with: Cursor
</commit_message>
<xml_diff>
--- a/data/source-resume.docx
+++ b/data/source-resume.docx
@@ -85,7 +85,7 @@
         </w:rPr>
         <w:t xml:space="preserve"> </w:t>
       </w:r>
-      <w:hyperlink r:id="rId5">
+      <w:hyperlink r:id="rId6">
         <w:r>
           <w:rPr>
             <w:color w:val="457885"/>
@@ -110,7 +110,7 @@
         </w:rPr>
         <w:t xml:space="preserve"> </w:t>
       </w:r>
-      <w:hyperlink r:id="rId6">
+      <w:hyperlink r:id="rId7">
         <w:r>
           <w:rPr>
             <w:color w:val="457885"/>
@@ -123,7 +123,7 @@
       <w:r>
         <w:t xml:space="preserve"> | </w:t>
       </w:r>
-      <w:hyperlink r:id="rId7" w:history="1">
+      <w:hyperlink r:id="rId8" w:history="1">
         <w:r>
           <w:rPr>
             <w:color w:val="457885"/>
@@ -3783,6 +3783,13 @@
           <w:smallCaps/>
           <w:spacing w:val="-2"/>
         </w:rPr>
+        <w:t xml:space="preserve"> </w:t>
+      </w:r>
+      <w:r>
+        <w:rPr>
+          <w:smallCaps/>
+          <w:spacing w:val="-2"/>
+        </w:rPr>
         <w:t>Education</w:t>
       </w:r>
     </w:p>
@@ -3897,6 +3904,12 @@
         <w:rPr>
           <w:b/>
         </w:rPr>
+        <w:t xml:space="preserve">   </w:t>
+      </w:r>
+      <w:r>
+        <w:rPr>
+          <w:b/>
+        </w:rPr>
         <w:t>Syracuse</w:t>
       </w:r>
       <w:r>
@@ -3960,12 +3973,20 @@
       <w:pPr>
         <w:pStyle w:val="BodyText"/>
         <w:tabs>
+          <w:tab w:val="center" w:pos="270"/>
+          <w:tab w:val="center" w:pos="360"/>
+          <w:tab w:val="center" w:pos="540"/>
+          <w:tab w:val="center" w:pos="810"/>
+          <w:tab w:val="center" w:pos="900"/>
           <w:tab w:val="left" w:pos="9111"/>
         </w:tabs>
         <w:spacing w:before="38"/>
         <w:ind w:left="97"/>
       </w:pPr>
       <w:r>
+        <w:t xml:space="preserve">   </w:t>
+      </w:r>
+      <w:r>
         <w:t>Master</w:t>
       </w:r>
       <w:r>
@@ -4017,7 +4038,7 @@
         <w:t>Systems</w:t>
       </w:r>
       <w:r>
-        <w:t xml:space="preserve">                                                                                       </w:t>
+        <w:t xml:space="preserve">                                                                                     </w:t>
       </w:r>
       <w:r>
         <w:t>Syracuse,</w:t>
@@ -4048,6 +4069,169 @@
       </w:pPr>
       <w:r>
         <w:t xml:space="preserve"> </w:t>
+      </w:r>
+    </w:p>
+    <w:p>
+      <w:pPr>
+        <w:pStyle w:val="BodyText"/>
+        <w:tabs>
+          <w:tab w:val="left" w:pos="8506"/>
+          <w:tab w:val="left" w:pos="9056"/>
+        </w:tabs>
+        <w:spacing w:line="276" w:lineRule="auto"/>
+        <w:ind w:left="0" w:right="360"/>
+      </w:pPr>
+      <w:r>
+        <w:rPr>
+          <w:b/>
+        </w:rPr>
+        <w:t xml:space="preserve">    </w:t>
+      </w:r>
+      <w:r>
+        <w:rPr>
+          <w:b/>
+        </w:rPr>
+        <w:t xml:space="preserve">Mumbai University </w:t>
+      </w:r>
+      <w:r>
+        <w:t>--</w:t>
+      </w:r>
+      <w:r>
+        <w:t xml:space="preserve"> Ramrao Adik Institute of Technology</w:t>
+      </w:r>
+      <w:r>
+        <w:t xml:space="preserve">                                                     </w:t>
+      </w:r>
+      <w:r>
+        <w:t>Aug</w:t>
+      </w:r>
+      <w:r>
+        <w:rPr>
+          <w:spacing w:val="-8"/>
+        </w:rPr>
+        <w:t xml:space="preserve"> </w:t>
+      </w:r>
+      <w:r>
+        <w:t>2019</w:t>
+      </w:r>
+      <w:r>
+        <w:rPr>
+          <w:spacing w:val="-9"/>
+        </w:rPr>
+        <w:t xml:space="preserve"> </w:t>
+      </w:r>
+      <w:r>
+        <w:t>-</w:t>
+      </w:r>
+      <w:r>
+        <w:rPr>
+          <w:spacing w:val="-9"/>
+        </w:rPr>
+        <w:t xml:space="preserve"> </w:t>
+      </w:r>
+      <w:r>
+        <w:t>Jul</w:t>
+      </w:r>
+      <w:r>
+        <w:rPr>
+          <w:spacing w:val="-8"/>
+        </w:rPr>
+        <w:t xml:space="preserve"> </w:t>
+      </w:r>
+      <w:r>
+        <w:t>2023</w:t>
+      </w:r>
+    </w:p>
+    <w:p>
+      <w:pPr>
+        <w:pStyle w:val="BodyText"/>
+        <w:tabs>
+          <w:tab w:val="center" w:pos="270"/>
+          <w:tab w:val="center" w:pos="360"/>
+          <w:tab w:val="left" w:pos="8506"/>
+          <w:tab w:val="left" w:pos="9056"/>
+        </w:tabs>
+        <w:spacing w:line="276" w:lineRule="auto"/>
+        <w:ind w:left="0" w:right="360"/>
+        <w:rPr>
+          <w:spacing w:val="-5"/>
+        </w:rPr>
+      </w:pPr>
+      <w:r>
+        <w:t xml:space="preserve">    </w:t>
+      </w:r>
+      <w:r>
+        <w:t>Bachelor</w:t>
+      </w:r>
+      <w:r>
+        <w:rPr>
+          <w:spacing w:val="-5"/>
+        </w:rPr>
+        <w:t xml:space="preserve"> </w:t>
+      </w:r>
+      <w:r>
+        <w:t>of</w:t>
+      </w:r>
+      <w:r>
+        <w:rPr>
+          <w:spacing w:val="-4"/>
+        </w:rPr>
+        <w:t xml:space="preserve"> </w:t>
+      </w:r>
+      <w:r>
+        <w:t>Engineering</w:t>
+      </w:r>
+      <w:r>
+        <w:rPr>
+          <w:spacing w:val="-2"/>
+        </w:rPr>
+        <w:t xml:space="preserve"> </w:t>
+      </w:r>
+      <w:r>
+        <w:t>in</w:t>
+      </w:r>
+      <w:r>
+        <w:rPr>
+          <w:spacing w:val="-4"/>
+        </w:rPr>
+        <w:t xml:space="preserve"> </w:t>
+      </w:r>
+      <w:r>
+        <w:t>Electronics</w:t>
+      </w:r>
+      <w:r>
+        <w:rPr>
+          <w:spacing w:val="-3"/>
+        </w:rPr>
+        <w:t xml:space="preserve"> </w:t>
+      </w:r>
+      <w:r>
+        <w:rPr>
+          <w:spacing w:val="-2"/>
+        </w:rPr>
+        <w:t>Engineering</w:t>
+      </w:r>
+      <w:r>
+        <w:tab/>
+        <w:t xml:space="preserve"> </w:t>
+      </w:r>
+      <w:r>
+        <w:t xml:space="preserve">         </w:t>
+      </w:r>
+      <w:r>
+        <w:t>Mumbai,</w:t>
+      </w:r>
+      <w:r>
+        <w:rPr>
+          <w:spacing w:val="-4"/>
+        </w:rPr>
+        <w:t xml:space="preserve"> </w:t>
+      </w:r>
+      <w:r>
+        <w:rPr>
+          <w:spacing w:val="-5"/>
+        </w:rPr>
+        <w:t>India</w:t>
       </w:r>
     </w:p>
     <w:p>
@@ -4060,146 +4244,381 @@
         <w:spacing w:line="276" w:lineRule="auto"/>
         <w:ind w:left="90" w:right="360" w:firstLine="7"/>
       </w:pPr>
-      <w:r>
-        <w:rPr>
-          <w:b/>
-        </w:rPr>
-        <w:t xml:space="preserve">Mumbai University </w:t>
-      </w:r>
-      <w:r>
-        <w:t>--</w:t>
-      </w:r>
-      <w:r>
-        <w:t xml:space="preserve"> Ramrao Adik Institute of Technology</w:t>
-      </w:r>
-      <w:r>
-        <w:tab/>
-      </w:r>
-      <w:r>
-        <w:t xml:space="preserve"> </w:t>
-      </w:r>
-      <w:r>
-        <w:t>Aug</w:t>
-      </w:r>
-      <w:r>
-        <w:rPr>
-          <w:spacing w:val="-8"/>
-        </w:rPr>
-        <w:t xml:space="preserve"> </w:t>
-      </w:r>
-      <w:r>
-        <w:t>201</w:t>
-      </w:r>
-      <w:r>
-        <w:t>9</w:t>
-      </w:r>
-      <w:r>
-        <w:rPr>
+    </w:p>
+    <w:p>
+      <w:pPr>
+        <w:pStyle w:val="BodyText"/>
+        <w:spacing w:before="9"/>
+        <w:ind w:left="0"/>
+        <w:rPr>
+          <w:b/>
+          <w:sz w:val="4"/>
+        </w:rPr>
+      </w:pPr>
+    </w:p>
+    <w:p>
+      <w:pPr>
+        <w:pStyle w:val="Heading1"/>
+        <w:spacing w:before="204"/>
+        <w:rPr>
+          <w:smallCaps/>
+          <w:spacing w:val="-2"/>
+        </w:rPr>
+      </w:pPr>
+      <w:r>
+        <w:rPr>
+          <w:smallCaps/>
+          <w:spacing w:val="-2"/>
+        </w:rPr>
+        <w:t xml:space="preserve"> </w:t>
+      </w:r>
+      <w:r>
+        <w:rPr>
+          <w:smallCaps/>
+          <w:spacing w:val="-2"/>
+        </w:rPr>
+        <w:t>PROJECT</w:t>
+      </w:r>
+    </w:p>
+    <w:p>
+      <w:pPr>
+        <w:tabs>
+          <w:tab w:val="center" w:pos="180"/>
+          <w:tab w:val="center" w:pos="270"/>
+          <w:tab w:val="center" w:pos="360"/>
+          <w:tab w:val="center" w:pos="540"/>
+          <w:tab w:val="left" w:pos="9859"/>
+        </w:tabs>
+        <w:spacing w:before="120"/>
+        <w:rPr>
+          <w:b/>
+          <w:sz w:val="20"/>
+        </w:rPr>
+      </w:pPr>
+      <w:bookmarkStart w:id="0" w:name="Predictive_System_Monitoring_with_AI__De"/>
+      <w:bookmarkEnd w:id="0"/>
+      <w:r>
+        <w:rPr>
+          <w:smallCaps/>
+          <w:spacing w:val="-2"/>
+          <w:sz w:val="24"/>
+        </w:rPr>
+        <mc:AlternateContent>
+          <mc:Choice Requires="wps">
+            <w:drawing>
+              <wp:anchor distT="0" distB="0" distL="0" distR="0" simplePos="0" relativeHeight="487593472" behindDoc="1" locked="0" layoutInCell="1" allowOverlap="1" wp14:anchorId="51BF3039" wp14:editId="3C7C0681">
+                <wp:simplePos x="0" y="0"/>
+                <wp:positionH relativeFrom="page">
+                  <wp:posOffset>625475</wp:posOffset>
+                </wp:positionH>
+                <wp:positionV relativeFrom="paragraph">
+                  <wp:posOffset>66040</wp:posOffset>
+                </wp:positionV>
+                <wp:extent cx="6508750" cy="5715"/>
+                <wp:effectExtent l="0" t="0" r="0" b="0"/>
+                <wp:wrapTopAndBottom/>
+                <wp:docPr id="1232113219" name="Graphic 4"/>
+                <wp:cNvGraphicFramePr>
+                  <a:graphicFrameLocks xmlns:a="http://schemas.openxmlformats.org/drawingml/2006/main"/>
+                </wp:cNvGraphicFramePr>
+                <a:graphic xmlns:a="http://schemas.openxmlformats.org/drawingml/2006/main">
+                  <a:graphicData uri="http://schemas.microsoft.com/office/word/2010/wordprocessingShape">
+                    <wps:wsp>
+                      <wps:cNvSpPr>
+                        <a:spLocks/>
+                      </wps:cNvSpPr>
+                      <wps:spPr>
+                        <a:xfrm>
+                          <a:off x="0" y="0"/>
+                          <a:ext cx="6508750" cy="5715"/>
+                        </a:xfrm>
+                        <a:custGeom>
+                          <a:avLst/>
+                          <a:gdLst/>
+                          <a:ahLst/>
+                          <a:cxnLst/>
+                          <a:rect l="l" t="t" r="r" b="b"/>
+                          <a:pathLst>
+                            <a:path w="6509384" h="5715">
+                              <a:moveTo>
+                                <a:pt x="6504876" y="3812"/>
+                              </a:moveTo>
+                              <a:lnTo>
+                                <a:pt x="-399" y="3812"/>
+                              </a:lnTo>
+                              <a:lnTo>
+                                <a:pt x="-399" y="9523"/>
+                              </a:lnTo>
+                              <a:lnTo>
+                                <a:pt x="6504876" y="9523"/>
+                              </a:lnTo>
+                              <a:lnTo>
+                                <a:pt x="6504876" y="3812"/>
+                              </a:lnTo>
+                              <a:close/>
+                            </a:path>
+                          </a:pathLst>
+                        </a:custGeom>
+                        <a:solidFill>
+                          <a:srgbClr val="9E9E9E"/>
+                        </a:solidFill>
+                      </wps:spPr>
+                      <wps:bodyPr wrap="square" lIns="0" tIns="0" rIns="0" bIns="0" rtlCol="0">
+                        <a:prstTxWarp prst="textNoShape">
+                          <a:avLst/>
+                        </a:prstTxWarp>
+                        <a:noAutofit/>
+                      </wps:bodyPr>
+                    </wps:wsp>
+                  </a:graphicData>
+                </a:graphic>
+              </wp:anchor>
+            </w:drawing>
+          </mc:Choice>
+          <mc:Fallback>
+            <w:pict>
+              <v:shape w14:anchorId="3D09FB43" id="Graphic 4" o:spid="_x0000_s1026" style="position:absolute;margin-left:49.25pt;margin-top:5.2pt;width:512.5pt;height:.45pt;z-index:-15723008;visibility:visible;mso-wrap-style:square;mso-wrap-distance-left:0;mso-wrap-distance-top:0;mso-wrap-distance-right:0;mso-wrap-distance-bottom:0;mso-position-horizontal:absolute;mso-position-horizontal-relative:page;mso-position-vertical:absolute;mso-position-vertical-relative:text;v-text-anchor:top" coordsize="6509384,5715" o:gfxdata="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" path="m6504876,3812l-399,3812r,5711l6504876,9523r,-5711xe" fillcolor="#9e9e9e" stroked="f">
+                <v:path arrowok="t"/>
+                <w10:wrap type="topAndBottom" anchorx="page"/>
+              </v:shape>
+            </w:pict>
+          </mc:Fallback>
+        </mc:AlternateContent>
+      </w:r>
+      <w:r>
+        <w:rPr>
+          <w:b/>
+        </w:rPr>
+        <w:t xml:space="preserve">    </w:t>
+      </w:r>
+      <w:r>
+        <w:rPr>
+          <w:b/>
+        </w:rPr>
+        <w:t>Syracuse Student Marketplace</w:t>
+      </w:r>
+      <w:r>
+        <w:rPr>
+          <w:b/>
+        </w:rPr>
+        <w:t xml:space="preserve">                                                                                              </w:t>
+      </w:r>
+      <w:r>
+        <w:rPr>
+          <w:b/>
+        </w:rPr>
+        <w:t xml:space="preserve">                    </w:t>
+      </w:r>
+      <w:r>
+        <w:rPr>
+          <w:bCs/>
+          <w:sz w:val="20"/>
+        </w:rPr>
+        <w:t>March</w:t>
+      </w:r>
+      <w:r>
+        <w:rPr>
+          <w:bCs/>
           <w:spacing w:val="-9"/>
-        </w:rPr>
-        <w:t xml:space="preserve"> </w:t>
-      </w:r>
-      <w:r>
-        <w:t>-</w:t>
-      </w:r>
-      <w:r>
-        <w:rPr>
-          <w:spacing w:val="-9"/>
-        </w:rPr>
-        <w:t xml:space="preserve"> </w:t>
-      </w:r>
-      <w:r>
-        <w:t>Jul</w:t>
-      </w:r>
-      <w:r>
-        <w:rPr>
-          <w:spacing w:val="-8"/>
-        </w:rPr>
-        <w:t xml:space="preserve"> </w:t>
-      </w:r>
-      <w:r>
+          <w:sz w:val="20"/>
+        </w:rPr>
+        <w:t xml:space="preserve"> </w:t>
+      </w:r>
+      <w:r>
+        <w:rPr>
+          <w:bCs/>
+          <w:spacing w:val="-4"/>
+          <w:sz w:val="20"/>
+        </w:rPr>
         <w:t>202</w:t>
       </w:r>
       <w:r>
-        <w:t>3</w:t>
-      </w:r>
-      <w:r>
-        <w:t xml:space="preserve"> Bachelor</w:t>
-      </w:r>
-      <w:r>
-        <w:rPr>
-          <w:spacing w:val="-5"/>
-        </w:rPr>
-        <w:t xml:space="preserve"> </w:t>
-      </w:r>
-      <w:r>
-        <w:t>of</w:t>
-      </w:r>
-      <w:r>
-        <w:rPr>
-          <w:spacing w:val="-4"/>
-        </w:rPr>
-        <w:t xml:space="preserve"> </w:t>
-      </w:r>
-      <w:r>
-        <w:t>Engineering</w:t>
-      </w:r>
-      <w:r>
-        <w:rPr>
-          <w:spacing w:val="-2"/>
-        </w:rPr>
-        <w:t xml:space="preserve"> </w:t>
-      </w:r>
-      <w:r>
-        <w:t>in</w:t>
-      </w:r>
-      <w:r>
-        <w:rPr>
-          <w:spacing w:val="-4"/>
-        </w:rPr>
-        <w:t xml:space="preserve"> </w:t>
-      </w:r>
-      <w:r>
-        <w:t>Electronics</w:t>
-      </w:r>
-      <w:r>
-        <w:rPr>
-          <w:spacing w:val="-3"/>
-        </w:rPr>
-        <w:t xml:space="preserve"> </w:t>
-      </w:r>
-      <w:r>
-        <w:rPr>
-          <w:spacing w:val="-2"/>
-        </w:rPr>
-        <w:t>Engineering</w:t>
-      </w:r>
-      <w:r>
-        <w:tab/>
-      </w:r>
-      <w:r>
-        <w:t xml:space="preserve">         </w:t>
-      </w:r>
-      <w:r>
-        <w:t>Mumbai,</w:t>
-      </w:r>
-      <w:r>
-        <w:rPr>
-          <w:spacing w:val="-4"/>
-        </w:rPr>
-        <w:t xml:space="preserve"> </w:t>
-      </w:r>
-      <w:r>
-        <w:rPr>
-          <w:spacing w:val="-5"/>
-        </w:rPr>
-        <w:t>I</w:t>
-      </w:r>
-      <w:r>
-        <w:rPr>
-          <w:spacing w:val="-5"/>
-        </w:rPr>
-        <w:t>ndia</w:t>
+        <w:rPr>
+          <w:bCs/>
+          <w:spacing w:val="-4"/>
+          <w:sz w:val="20"/>
+        </w:rPr>
+        <w:t>6</w:t>
+      </w:r>
+    </w:p>
+    <w:p>
+      <w:pPr>
+        <w:pStyle w:val="BodyText"/>
+        <w:numPr>
+          <w:ilvl w:val="0"/>
+          <w:numId w:val="4"/>
+        </w:numPr>
+        <w:tabs>
+          <w:tab w:val="center" w:pos="270"/>
+          <w:tab w:val="center" w:pos="360"/>
+          <w:tab w:val="center" w:pos="540"/>
+          <w:tab w:val="center" w:pos="810"/>
+          <w:tab w:val="center" w:pos="900"/>
+          <w:tab w:val="left" w:pos="9111"/>
+        </w:tabs>
+        <w:spacing w:before="38"/>
+      </w:pPr>
+      <w:r>
+        <w:t xml:space="preserve">Engineered </w:t>
+      </w:r>
+      <w:r>
+        <w:rPr>
+          <w:b/>
+          <w:bCs/>
+        </w:rPr>
+        <w:t>row-level security (RLS)</w:t>
+      </w:r>
+      <w:r>
+        <w:t xml:space="preserve"> </w:t>
+      </w:r>
+      <w:r>
+        <w:t xml:space="preserve">policies in </w:t>
+      </w:r>
+      <w:r>
+        <w:rPr>
+          <w:b/>
+          <w:bCs/>
+        </w:rPr>
+        <w:t>PostgreSQL</w:t>
+      </w:r>
+      <w:r>
+        <w:t xml:space="preserve"> via </w:t>
+      </w:r>
+      <w:proofErr w:type="spellStart"/>
+      <w:r>
+        <w:rPr>
+          <w:b/>
+          <w:bCs/>
+        </w:rPr>
+        <w:t>Supabase</w:t>
+      </w:r>
+      <w:proofErr w:type="spellEnd"/>
+      <w:r>
+        <w:t xml:space="preserve"> to restrict listing</w:t>
+      </w:r>
+      <w:r>
+        <w:t xml:space="preserve"> </w:t>
+      </w:r>
+      <w:r>
+        <w:t>access and messaging to verified Syracuse .</w:t>
+      </w:r>
+      <w:proofErr w:type="spellStart"/>
+      <w:r>
+        <w:t>edu</w:t>
+      </w:r>
+      <w:proofErr w:type="spellEnd"/>
+      <w:r>
+        <w:t xml:space="preserve"> users, preventing unauthorized data exposure across</w:t>
+      </w:r>
+      <w:r>
+        <w:t xml:space="preserve"> 500</w:t>
+      </w:r>
+      <w:r>
+        <w:t xml:space="preserve"> listings</w:t>
+      </w:r>
+      <w:r>
+        <w:t>.</w:t>
+      </w:r>
+    </w:p>
+    <w:p>
+      <w:pPr>
+        <w:pStyle w:val="BodyText"/>
+        <w:numPr>
+          <w:ilvl w:val="0"/>
+          <w:numId w:val="4"/>
+        </w:numPr>
+        <w:tabs>
+          <w:tab w:val="center" w:pos="270"/>
+          <w:tab w:val="center" w:pos="360"/>
+          <w:tab w:val="center" w:pos="540"/>
+          <w:tab w:val="center" w:pos="810"/>
+          <w:tab w:val="center" w:pos="900"/>
+          <w:tab w:val="left" w:pos="9111"/>
+        </w:tabs>
+        <w:spacing w:before="38"/>
+      </w:pPr>
+      <w:r>
+        <w:t xml:space="preserve">Built a full-stack peer-to-peer campus marketplace using </w:t>
+      </w:r>
+      <w:r>
+        <w:rPr>
+          <w:b/>
+          <w:bCs/>
+        </w:rPr>
+        <w:t>Next.js 14</w:t>
+      </w:r>
+      <w:r>
+        <w:t xml:space="preserve">, </w:t>
+      </w:r>
+      <w:proofErr w:type="spellStart"/>
+      <w:r>
+        <w:t>Supabase</w:t>
+      </w:r>
+      <w:proofErr w:type="spellEnd"/>
+      <w:r>
+        <w:t xml:space="preserve">, and </w:t>
+      </w:r>
+      <w:proofErr w:type="spellStart"/>
+      <w:r>
+        <w:t>Vercel</w:t>
+      </w:r>
+      <w:proofErr w:type="spellEnd"/>
+      <w:r>
+        <w:t xml:space="preserve"> </w:t>
+      </w:r>
+      <w:r>
+        <w:t xml:space="preserve">with </w:t>
+      </w:r>
+      <w:r>
+        <w:rPr>
+          <w:b/>
+          <w:bCs/>
+        </w:rPr>
+        <w:t>real-time</w:t>
+      </w:r>
+      <w:r>
+        <w:t xml:space="preserve"> </w:t>
+      </w:r>
+    </w:p>
+    <w:p>
+      <w:pPr>
+        <w:pStyle w:val="BodyText"/>
+        <w:tabs>
+          <w:tab w:val="center" w:pos="270"/>
+          <w:tab w:val="center" w:pos="360"/>
+          <w:tab w:val="center" w:pos="540"/>
+          <w:tab w:val="center" w:pos="810"/>
+          <w:tab w:val="center" w:pos="900"/>
+          <w:tab w:val="left" w:pos="9111"/>
+        </w:tabs>
+        <w:spacing w:before="38"/>
+        <w:ind w:left="817"/>
+      </w:pPr>
+      <w:r>
+        <w:t xml:space="preserve">listing updates and university email-gated </w:t>
+      </w:r>
+      <w:r>
+        <w:rPr>
+          <w:b/>
+          <w:bCs/>
+        </w:rPr>
+        <w:t>authentication</w:t>
+      </w:r>
+      <w:r>
+        <w:t>,</w:t>
+      </w:r>
+      <w:r>
+        <w:rPr>
+          <w:b/>
+          <w:bCs/>
+        </w:rPr>
+        <w:t xml:space="preserve"> </w:t>
+      </w:r>
+      <w:r>
+        <w:t>deployed and live for Syracuse students</w:t>
+      </w:r>
+      <w:r>
+        <w:t>.</w:t>
       </w:r>
     </w:p>
     <w:sectPr>
@@ -4215,6 +4634,127 @@
 <file path=word/numbering.xml><?xml version="1.0" encoding="utf-8"?>
 <w:numbering xmlns:wpc="http://schemas.microsoft.com/office/word/2010/wordprocessingCanvas" xmlns:cx="http://schemas.microsoft.com/office/drawing/2014/chartex" xmlns:cx1="http://schemas.microsoft.com/office/drawing/2015/9/8/chartex" xmlns:cx2="http://schemas.microsoft.com/office/drawing/2015/10/21/chartex" xmlns:cx3="http://schemas.microsoft.com/office/drawing/2016/5/9/chartex" xmlns:cx4="http://schemas.microsoft.com/office/drawing/2016/5/10/chartex" xmlns:cx5="http://schemas.microsoft.com/office/drawing/2016/5/11/chartex" xmlns:cx6="http://schemas.microsoft.com/office/drawing/2016/5/12/chartex" xmlns:cx7="http://schemas.microsoft.com/office/drawing/2016/5/13/chartex" xmlns:cx8="http://schemas.microsoft.com/office/drawing/2016/5/14/chartex" xmlns:mc="http://schemas.openxmlformats.org/markup-compatibility/2006" xmlns:aink="http://schemas.microsoft.com/office/drawing/2016/ink" xmlns:am3d="http://schemas.microsoft.com/office/drawing/2017/model3d" xmlns:o="urn:schemas-microsoft-com:office:office" xmlns:oel="http://schemas.microsoft.com/office/2019/extlst" xmlns:r="http://schemas.openxmlformats.org/officeDocument/2006/relationships" xmlns:m="http://schemas.openxmlformats.org/officeDocument/2006/math" xmlns:v="urn:schemas-microsoft-com:vml" xmlns:wp14="http://schemas.microsoft.com/office/word/2010/wordprocessingDrawing" xmlns:wp="http://schemas.openxmlformats.org/drawingml/2006/wordprocessingDrawing" xmlns:w10="urn:schemas-microsoft-com:office:word" xmlns:w="http://schemas.openxmlformats.org/wordprocessingml/2006/main" xmlns:w14="http://schemas.microsoft.com/office/word/2010/wordml" xmlns:w15="http://schemas.microsoft.com/office/word/2012/wordml" xmlns:w16cex="http://schemas.microsoft.com/office/word/2018/wordml/cex" xmlns:w16cid="http://schemas.microsoft.com/office/word/2016/wordml/cid" xmlns:w16="http://schemas.microsoft.com/office/word/2018/wordml" xmlns:w16du="http://schemas.microsoft.com/office/word/2023/wordml/word16du" xmlns:w16sdtdh="http://schemas.microsoft.com/office/word/2020/wordml/sdtdatahash" xmlns:w16sdtfl="http://schemas.microsoft.com/office/word/2024/wordml/sdtformatlock" xmlns:w16se="http://schemas.microsoft.com/office/word/2015/wordml/symex" xmlns:wpg="http://schemas.microsoft.com/office/word/2010/wordprocessingGroup" xmlns:wpi="http://schemas.microsoft.com/office/word/2010/wordprocessingInk" xmlns:wne="http://schemas.microsoft.com/office/word/2006/wordml" xmlns:wps="http://schemas.microsoft.com/office/word/2010/wordprocessingShape" mc:Ignorable="w14 w15 w16se w16cid w16 w16cex w16sdtdh w16sdtfl w16du wp14">
   <w:abstractNum w:abstractNumId="0" w15:restartNumberingAfterBreak="0">
+    <w:nsid w:val="02F17F7D"/>
+    <w:multiLevelType w:val="hybridMultilevel"/>
+    <w:tmpl w:val="EDBA7CA6"/>
+    <w:lvl w:ilvl="0" w:tplc="A8240FE6">
+      <w:numFmt w:val="bullet"/>
+      <w:lvlText w:val="•"/>
+      <w:lvlJc w:val="left"/>
+      <w:pPr>
+        <w:ind w:left="720" w:hanging="360"/>
+      </w:pPr>
+      <w:rPr>
+        <w:rFonts w:ascii="Calibri" w:eastAsia="Calibri" w:hAnsi="Calibri" w:cs="Calibri" w:hint="default"/>
+        <w:b w:val="0"/>
+        <w:bCs w:val="0"/>
+        <w:i w:val="0"/>
+        <w:iCs w:val="0"/>
+        <w:spacing w:val="0"/>
+        <w:w w:val="100"/>
+        <w:sz w:val="20"/>
+        <w:szCs w:val="20"/>
+        <w:lang w:val="en-US" w:eastAsia="en-US" w:bidi="ar-SA"/>
+      </w:rPr>
+    </w:lvl>
+    <w:lvl w:ilvl="1" w:tplc="346C5A02">
+      <w:numFmt w:val="bullet"/>
+      <w:lvlText w:val="•"/>
+      <w:lvlJc w:val="left"/>
+      <w:pPr>
+        <w:ind w:left="1800" w:hanging="360"/>
+      </w:pPr>
+      <w:rPr>
+        <w:rFonts w:hint="default"/>
+        <w:lang w:val="en-US" w:eastAsia="en-US" w:bidi="ar-SA"/>
+      </w:rPr>
+    </w:lvl>
+    <w:lvl w:ilvl="2" w:tplc="88CC8C42">
+      <w:numFmt w:val="bullet"/>
+      <w:lvlText w:val="•"/>
+      <w:lvlJc w:val="left"/>
+      <w:pPr>
+        <w:ind w:left="2880" w:hanging="360"/>
+      </w:pPr>
+      <w:rPr>
+        <w:rFonts w:hint="default"/>
+        <w:lang w:val="en-US" w:eastAsia="en-US" w:bidi="ar-SA"/>
+      </w:rPr>
+    </w:lvl>
+    <w:lvl w:ilvl="3" w:tplc="3C9EF0A4">
+      <w:numFmt w:val="bullet"/>
+      <w:lvlText w:val="•"/>
+      <w:lvlJc w:val="left"/>
+      <w:pPr>
+        <w:ind w:left="3960" w:hanging="360"/>
+      </w:pPr>
+      <w:rPr>
+        <w:rFonts w:hint="default"/>
+        <w:lang w:val="en-US" w:eastAsia="en-US" w:bidi="ar-SA"/>
+      </w:rPr>
+    </w:lvl>
+    <w:lvl w:ilvl="4" w:tplc="5A644B18">
+      <w:numFmt w:val="bullet"/>
+      <w:lvlText w:val="•"/>
+      <w:lvlJc w:val="left"/>
+      <w:pPr>
+        <w:ind w:left="5040" w:hanging="360"/>
+      </w:pPr>
+      <w:rPr>
+        <w:rFonts w:hint="default"/>
+        <w:lang w:val="en-US" w:eastAsia="en-US" w:bidi="ar-SA"/>
+      </w:rPr>
+    </w:lvl>
+    <w:lvl w:ilvl="5" w:tplc="60DAE316">
+      <w:numFmt w:val="bullet"/>
+      <w:lvlText w:val="•"/>
+      <w:lvlJc w:val="left"/>
+      <w:pPr>
+        <w:ind w:left="6120" w:hanging="360"/>
+      </w:pPr>
+      <w:rPr>
+        <w:rFonts w:hint="default"/>
+        <w:lang w:val="en-US" w:eastAsia="en-US" w:bidi="ar-SA"/>
+      </w:rPr>
+    </w:lvl>
+    <w:lvl w:ilvl="6" w:tplc="73CCC2D2">
+      <w:numFmt w:val="bullet"/>
+      <w:lvlText w:val="•"/>
+      <w:lvlJc w:val="left"/>
+      <w:pPr>
+        <w:ind w:left="7200" w:hanging="360"/>
+      </w:pPr>
+      <w:rPr>
+        <w:rFonts w:hint="default"/>
+        <w:lang w:val="en-US" w:eastAsia="en-US" w:bidi="ar-SA"/>
+      </w:rPr>
+    </w:lvl>
+    <w:lvl w:ilvl="7" w:tplc="8F868058">
+      <w:numFmt w:val="bullet"/>
+      <w:lvlText w:val="•"/>
+      <w:lvlJc w:val="left"/>
+      <w:pPr>
+        <w:ind w:left="8280" w:hanging="360"/>
+      </w:pPr>
+      <w:rPr>
+        <w:rFonts w:hint="default"/>
+        <w:lang w:val="en-US" w:eastAsia="en-US" w:bidi="ar-SA"/>
+      </w:rPr>
+    </w:lvl>
+    <w:lvl w:ilvl="8" w:tplc="4FA616B6">
+      <w:numFmt w:val="bullet"/>
+      <w:lvlText w:val="•"/>
+      <w:lvlJc w:val="left"/>
+      <w:pPr>
+        <w:ind w:left="9360" w:hanging="360"/>
+      </w:pPr>
+      <w:rPr>
+        <w:rFonts w:hint="default"/>
+        <w:lang w:val="en-US" w:eastAsia="en-US" w:bidi="ar-SA"/>
+      </w:rPr>
+    </w:lvl>
+  </w:abstractNum>
+  <w:abstractNum w:abstractNumId="1" w15:restartNumberingAfterBreak="0">
     <w:nsid w:val="38280582"/>
     <w:multiLevelType w:val="hybridMultilevel"/>
     <w:tmpl w:val="0AACDE82"/>
@@ -4335,7 +4875,7 @@
       </w:rPr>
     </w:lvl>
   </w:abstractNum>
-  <w:abstractNum w:abstractNumId="1" w15:restartNumberingAfterBreak="0">
+  <w:abstractNum w:abstractNumId="2" w15:restartNumberingAfterBreak="0">
     <w:nsid w:val="57E2370D"/>
     <w:multiLevelType w:val="hybridMultilevel"/>
     <w:tmpl w:val="6AE68106"/>
@@ -4464,11 +5004,138 @@
       </w:rPr>
     </w:lvl>
   </w:abstractNum>
+  <w:abstractNum w:abstractNumId="3" w15:restartNumberingAfterBreak="0">
+    <w:nsid w:val="716E48B9"/>
+    <w:multiLevelType w:val="hybridMultilevel"/>
+    <w:tmpl w:val="65D87F16"/>
+    <w:lvl w:ilvl="0" w:tplc="A8240FE6">
+      <w:numFmt w:val="bullet"/>
+      <w:lvlText w:val="•"/>
+      <w:lvlJc w:val="left"/>
+      <w:pPr>
+        <w:ind w:left="817" w:hanging="360"/>
+      </w:pPr>
+      <w:rPr>
+        <w:rFonts w:ascii="Calibri" w:eastAsia="Calibri" w:hAnsi="Calibri" w:cs="Calibri" w:hint="default"/>
+        <w:b w:val="0"/>
+        <w:bCs w:val="0"/>
+        <w:i w:val="0"/>
+        <w:iCs w:val="0"/>
+        <w:spacing w:val="0"/>
+        <w:w w:val="100"/>
+        <w:sz w:val="20"/>
+        <w:szCs w:val="20"/>
+        <w:lang w:val="en-US" w:eastAsia="en-US" w:bidi="ar-SA"/>
+      </w:rPr>
+    </w:lvl>
+    <w:lvl w:ilvl="1" w:tplc="04090003" w:tentative="1">
+      <w:start w:val="1"/>
+      <w:numFmt w:val="bullet"/>
+      <w:lvlText w:val="o"/>
+      <w:lvlJc w:val="left"/>
+      <w:pPr>
+        <w:ind w:left="1537" w:hanging="360"/>
+      </w:pPr>
+      <w:rPr>
+        <w:rFonts w:ascii="Courier New" w:hAnsi="Courier New" w:hint="default"/>
+      </w:rPr>
+    </w:lvl>
+    <w:lvl w:ilvl="2" w:tplc="04090005" w:tentative="1">
+      <w:start w:val="1"/>
+      <w:numFmt w:val="bullet"/>
+      <w:lvlText w:val=""/>
+      <w:lvlJc w:val="left"/>
+      <w:pPr>
+        <w:ind w:left="2257" w:hanging="360"/>
+      </w:pPr>
+      <w:rPr>
+        <w:rFonts w:ascii="Wingdings" w:hAnsi="Wingdings" w:hint="default"/>
+      </w:rPr>
+    </w:lvl>
+    <w:lvl w:ilvl="3" w:tplc="04090001" w:tentative="1">
+      <w:start w:val="1"/>
+      <w:numFmt w:val="bullet"/>
+      <w:lvlText w:val=""/>
+      <w:lvlJc w:val="left"/>
+      <w:pPr>
+        <w:ind w:left="2977" w:hanging="360"/>
+      </w:pPr>
+      <w:rPr>
+        <w:rFonts w:ascii="Symbol" w:hAnsi="Symbol" w:hint="default"/>
+      </w:rPr>
+    </w:lvl>
+    <w:lvl w:ilvl="4" w:tplc="04090003" w:tentative="1">
+      <w:start w:val="1"/>
+      <w:numFmt w:val="bullet"/>
+      <w:lvlText w:val="o"/>
+      <w:lvlJc w:val="left"/>
+      <w:pPr>
+        <w:ind w:left="3697" w:hanging="360"/>
+      </w:pPr>
+      <w:rPr>
+        <w:rFonts w:ascii="Courier New" w:hAnsi="Courier New" w:hint="default"/>
+      </w:rPr>
+    </w:lvl>
+    <w:lvl w:ilvl="5" w:tplc="04090005" w:tentative="1">
+      <w:start w:val="1"/>
+      <w:numFmt w:val="bullet"/>
+      <w:lvlText w:val=""/>
+      <w:lvlJc w:val="left"/>
+      <w:pPr>
+        <w:ind w:left="4417" w:hanging="360"/>
+      </w:pPr>
+      <w:rPr>
+        <w:rFonts w:ascii="Wingdings" w:hAnsi="Wingdings" w:hint="default"/>
+      </w:rPr>
+    </w:lvl>
+    <w:lvl w:ilvl="6" w:tplc="04090001" w:tentative="1">
+      <w:start w:val="1"/>
+      <w:numFmt w:val="bullet"/>
+      <w:lvlText w:val=""/>
+      <w:lvlJc w:val="left"/>
+      <w:pPr>
+        <w:ind w:left="5137" w:hanging="360"/>
+      </w:pPr>
+      <w:rPr>
+        <w:rFonts w:ascii="Symbol" w:hAnsi="Symbol" w:hint="default"/>
+      </w:rPr>
+    </w:lvl>
+    <w:lvl w:ilvl="7" w:tplc="04090003" w:tentative="1">
+      <w:start w:val="1"/>
+      <w:numFmt w:val="bullet"/>
+      <w:lvlText w:val="o"/>
+      <w:lvlJc w:val="left"/>
+      <w:pPr>
+        <w:ind w:left="5857" w:hanging="360"/>
+      </w:pPr>
+      <w:rPr>
+        <w:rFonts w:ascii="Courier New" w:hAnsi="Courier New" w:hint="default"/>
+      </w:rPr>
+    </w:lvl>
+    <w:lvl w:ilvl="8" w:tplc="04090005" w:tentative="1">
+      <w:start w:val="1"/>
+      <w:numFmt w:val="bullet"/>
+      <w:lvlText w:val=""/>
+      <w:lvlJc w:val="left"/>
+      <w:pPr>
+        <w:ind w:left="6577" w:hanging="360"/>
+      </w:pPr>
+      <w:rPr>
+        <w:rFonts w:ascii="Wingdings" w:hAnsi="Wingdings" w:hint="default"/>
+      </w:rPr>
+    </w:lvl>
+  </w:abstractNum>
   <w:num w:numId="1" w16cid:durableId="273707652">
+    <w:abstractNumId w:val="2"/>
+  </w:num>
+  <w:num w:numId="2" w16cid:durableId="1879583234">
     <w:abstractNumId w:val="1"/>
   </w:num>
-  <w:num w:numId="2" w16cid:durableId="1879583234">
+  <w:num w:numId="3" w16cid:durableId="732196586">
     <w:abstractNumId w:val="0"/>
+  </w:num>
+  <w:num w:numId="4" w16cid:durableId="1970892853">
+    <w:abstractNumId w:val="3"/>
   </w:num>
 </w:numbering>
 </file>
@@ -4985,6 +5652,22 @@
       <w:shd w:val="clear" w:color="auto" w:fill="E1DFDD"/>
     </w:rPr>
   </w:style>
+  <w:style w:type="paragraph" w:customStyle="1" w:styleId="p1">
+    <w:name w:val="p1"/>
+    <w:basedOn w:val="Normal"/>
+    <w:rsid w:val="00AB39C9"/>
+    <w:pPr>
+      <w:widowControl/>
+      <w:autoSpaceDE/>
+      <w:autoSpaceDN/>
+    </w:pPr>
+    <w:rPr>
+      <w:rFonts w:ascii="Helvetica" w:hAnsi="Helvetica"/>
+      <w:color w:val="000000"/>
+      <w:sz w:val="15"/>
+      <w:szCs w:val="15"/>
+    </w:rPr>
+  </w:style>
 </w:styles>
 </file>
 
@@ -5269,4 +5952,16 @@
   <a:objectDefaults/>
   <a:extraClrSchemeLst/>
 </a:theme>
+</file>
+
+<file path=customXml/item1.xml><?xml version="1.0" encoding="utf-8"?>
+<b:Sources xmlns:b="http://schemas.openxmlformats.org/officeDocument/2006/bibliography" xmlns="http://schemas.openxmlformats.org/officeDocument/2006/bibliography" SelectedStyle="/APASixthEditionOfficeOnline.xsl" StyleName="APA" Version="6"/>
+</file>
+
+<file path=customXml/itemProps1.xml><?xml version="1.0" encoding="utf-8"?>
+<ds:datastoreItem xmlns:ds="http://schemas.openxmlformats.org/officeDocument/2006/customXml" ds:itemID="{5E395753-5C67-B040-B880-D235C15E54D8}">
+  <ds:schemaRefs>
+    <ds:schemaRef ds:uri="http://schemas.openxmlformats.org/officeDocument/2006/bibliography"/>
+  </ds:schemaRefs>
+</ds:datastoreItem>
 </file>
</xml_diff>